<commit_message>
Update system to use new API key prefix
Replace all instances of "rasid_" with "rsdway_" in API keys and related documentation.

Replit-Commit-Author: Agent
Replit-Commit-Session-Id: 0c7849ff-7b81-4e2e-918f-1c076b15b9fa
Replit-Commit-Checkpoint-Type: full_checkpoint
Replit-Commit-Event-Id: c4da6a3d-ba68-4eea-8fea-0ed3d8c4a9ca
Replit-Commit-Screenshot-Url: https://storage.googleapis.com/screenshot-production-us-central1/6f135529-976d-45c0-8fe1-15eae65305e9/0c7849ff-7b81-4e2e-918f-1c076b15b9fa/G9twmsT
Replit-Helium-Checkpoint-Created: true
</commit_message>
<xml_diff>
--- a/docs/RSDWAY_API_Documentation.docx
+++ b/docs/RSDWAY_API_Documentation.docx
@@ -314,7 +314,7 @@
                 <w:rFonts w:ascii="Arial" w:hAnsi="Arial"/>
                 <w:sz w:val="18"/>
               </w:rPr>
-              <w:t>Header `X-API-Key: rasid_...`</w:t>
+              <w:t>Header `X-API-Key: rsdway_...`</w:t>
             </w:r>
           </w:p>
         </w:tc>
@@ -727,7 +727,7 @@
           <w:color w:val="333333"/>
           <w:sz w:val="18"/>
         </w:rPr>
-        <w:t>rasid_7f3a9b2c4e5d6f8a9b0c1d2e3f4a5b6c7d8e9f0a1b2c3d4e5f6a7b8c9d0e1f2a</w:t>
+        <w:t>rsdway_7f3a9b2c4e5d6f8a9b0c1d2e3f4a5b6c7d8e9f0a1b2c3d4e5f6a7b8c9d0e1f2a</w:t>
       </w:r>
     </w:p>
     <w:p/>
@@ -765,7 +765,7 @@
           <w:color w:val="333333"/>
           <w:sz w:val="18"/>
         </w:rPr>
-        <w:t>X-API-Key: rasid_your_full_key_here</w:t>
+        <w:t>X-API-Key: rsdway_your_full_key_here</w:t>
       </w:r>
     </w:p>
     <w:p/>
@@ -888,7 +888,7 @@
           <w:color w:val="333333"/>
           <w:sz w:val="18"/>
         </w:rPr>
-        <w:t xml:space="preserve">  -H "X-API-Key: rasid_your_key_here"</w:t>
+        <w:t xml:space="preserve">  -H "X-API-Key: rsdway_your_key_here"</w:t>
       </w:r>
     </w:p>
     <w:p/>
@@ -945,7 +945,7 @@
           <w:color w:val="333333"/>
           <w:sz w:val="18"/>
         </w:rPr>
-        <w:t xml:space="preserve">  -H "X-API-Key: rasid_your_key_here"</w:t>
+        <w:t xml:space="preserve">  -H "X-API-Key: rsdway_your_key_here"</w:t>
       </w:r>
     </w:p>
     <w:p/>
@@ -1016,7 +1016,7 @@
           <w:color w:val="333333"/>
           <w:sz w:val="18"/>
         </w:rPr>
-        <w:t xml:space="preserve">  -H "X-API-Key: rasid_your_key_here" \</w:t>
+        <w:t xml:space="preserve">  -H "X-API-Key: rsdway_your_key_here" \</w:t>
       </w:r>
     </w:p>
     <w:p>
@@ -1946,7 +1946,7 @@
           <w:color w:val="333333"/>
           <w:sz w:val="18"/>
         </w:rPr>
-        <w:t>Authorization: Bearer &lt;session&gt; OR X-API-Key: rasid_...</w:t>
+        <w:t>Authorization: Bearer &lt;session&gt; OR X-API-Key: rsdway_...</w:t>
       </w:r>
     </w:p>
     <w:p>
@@ -8045,7 +8045,7 @@
           <w:color w:val="333333"/>
           <w:sz w:val="18"/>
         </w:rPr>
-        <w:t>API_KEY = "rasid_your_key_here"</w:t>
+        <w:t>API_KEY = "rsdway_your_key_here"</w:t>
       </w:r>
     </w:p>
     <w:p>
@@ -9714,7 +9714,7 @@
           <w:color w:val="333333"/>
           <w:sz w:val="18"/>
         </w:rPr>
-        <w:t xml:space="preserve">  -H "X-API-Key: rasid_your_key" \</w:t>
+        <w:t xml:space="preserve">  -H "X-API-Key: rsdway_your_key" \</w:t>
       </w:r>
     </w:p>
     <w:p>
@@ -9797,7 +9797,7 @@
           <w:color w:val="333333"/>
           <w:sz w:val="18"/>
         </w:rPr>
-        <w:t xml:space="preserve">  -H "X-API-Key: rasid_your_key" \</w:t>
+        <w:t xml:space="preserve">  -H "X-API-Key: rsdway_your_key" \</w:t>
       </w:r>
     </w:p>
     <w:p>
@@ -9964,7 +9964,7 @@
           <w:color w:val="333333"/>
           <w:sz w:val="18"/>
         </w:rPr>
-        <w:t xml:space="preserve">  -H "X-API-Key: rasid_your_key" \</w:t>
+        <w:t xml:space="preserve">  -H "X-API-Key: rsdway_your_key" \</w:t>
       </w:r>
     </w:p>
     <w:p>
@@ -10117,7 +10117,7 @@
           <w:color w:val="333333"/>
           <w:sz w:val="18"/>
         </w:rPr>
-        <w:t xml:space="preserve">  -H "X-API-Key: rasid_your_key"</w:t>
+        <w:t xml:space="preserve">  -H "X-API-Key: rsdway_your_key"</w:t>
       </w:r>
     </w:p>
     <w:p/>
@@ -10607,7 +10607,7 @@
           <w:color w:val="333333"/>
           <w:sz w:val="18"/>
         </w:rPr>
-        <w:t>$rsd = new RsdwayClient("rasid_your_key_here");</w:t>
+        <w:t>$rsd = new RsdwayClient("rsdway_your_key_here");</w:t>
       </w:r>
     </w:p>
     <w:p>
@@ -10816,7 +10816,7 @@
           <w:color w:val="333333"/>
           <w:sz w:val="18"/>
         </w:rPr>
-        <w:t>const API_KEY = 'rasid_your_key_here';</w:t>
+        <w:t>const API_KEY = 'rsdway_your_key_here';</w:t>
       </w:r>
     </w:p>
     <w:p>
@@ -15821,7 +15821,7 @@
           <w:color w:val="333333"/>
           <w:sz w:val="18"/>
         </w:rPr>
-        <w:t xml:space="preserve">  "key": "rasid_7f3a9b2c4e5d6f8a9b0c1d2e3f4a5b6c7d8e9f0a1b2c3d4e5f6a7b8c9d0e1f2a",</w:t>
+        <w:t xml:space="preserve">  "key": "rsdway_7f3a9b2c4e5d6f8a9b0c1d2e3f4a5b6c7d8e9f0a1b2c3d4e5f6a7b8c9d0e1f2a",</w:t>
       </w:r>
     </w:p>
     <w:p>

</xml_diff>

<commit_message>
Update API endpoints to use the external version for key authentication
Modify API documentation to change operation paths from `/api/rasid/` to `/api/external/v1/` for external key authentication, while marking portal-only operations.

Replit-Commit-Author: Agent
Replit-Commit-Session-Id: 0c7849ff-7b81-4e2e-918f-1c076b15b9fa
Replit-Commit-Checkpoint-Type: full_checkpoint
Replit-Commit-Event-Id: 3ef4327b-f515-41c1-9a5f-2116624639b8
Replit-Commit-Screenshot-Url: https://storage.googleapis.com/screenshot-production-us-central1/6f135529-976d-45c0-8fe1-15eae65305e9/0c7849ff-7b81-4e2e-918f-1c076b15b9fa/G9twmsT
Replit-Helium-Checkpoint-Created: true
</commit_message>
<xml_diff>
--- a/docs/RSDWAY_API_Documentation.docx
+++ b/docs/RSDWAY_API_Documentation.docx
@@ -1932,7 +1932,7 @@
           <w:color w:val="333333"/>
           <w:sz w:val="18"/>
         </w:rPr>
-        <w:t>POST /api/rasid/import</w:t>
+        <w:t>POST /api/external/v1/import</w:t>
       </w:r>
     </w:p>
     <w:p>
@@ -2100,7 +2100,7 @@
           <w:color w:val="333333"/>
           <w:sz w:val="18"/>
         </w:rPr>
-        <w:t>POST /api/rasid/import-cancel</w:t>
+        <w:t>POST /api/rasid/import-cancel  ⚠️ Portal Session Only</w:t>
       </w:r>
     </w:p>
     <w:p>
@@ -2235,7 +2235,7 @@
           <w:color w:val="333333"/>
           <w:sz w:val="18"/>
         </w:rPr>
-        <w:t>POST /api/rasid/supply</w:t>
+        <w:t>POST /api/external/v1/supply</w:t>
       </w:r>
     </w:p>
     <w:p>
@@ -2375,7 +2375,7 @@
           <w:color w:val="333333"/>
           <w:sz w:val="18"/>
         </w:rPr>
-        <w:t>POST /api/rasid/supply-cancel</w:t>
+        <w:t>POST /api/rasid/supply-cancel  ⚠️ Portal Session Only</w:t>
       </w:r>
     </w:p>
     <w:p>
@@ -2501,7 +2501,7 @@
           <w:color w:val="333333"/>
           <w:sz w:val="18"/>
         </w:rPr>
-        <w:t>POST /api/rasid/dispatch</w:t>
+        <w:t>POST /api/external/v1/dispatch</w:t>
       </w:r>
     </w:p>
     <w:p>
@@ -2627,7 +2627,7 @@
           <w:color w:val="333333"/>
           <w:sz w:val="18"/>
         </w:rPr>
-        <w:t>POST /api/rasid/dispatch-cancel</w:t>
+        <w:t>POST /api/external/v1/dispatch-cancel</w:t>
       </w:r>
     </w:p>
     <w:p>
@@ -2753,7 +2753,7 @@
           <w:color w:val="333333"/>
           <w:sz w:val="18"/>
         </w:rPr>
-        <w:t>POST /api/rasid/dispatch-batch</w:t>
+        <w:t>POST /api/external/v1/dispatch-batch</w:t>
       </w:r>
     </w:p>
     <w:p>
@@ -2879,7 +2879,7 @@
           <w:color w:val="333333"/>
           <w:sz w:val="18"/>
         </w:rPr>
-        <w:t>POST /api/rasid/dispatch-cancel-batch</w:t>
+        <w:t>POST /api/external/v1/dispatch-cancel-batch</w:t>
       </w:r>
     </w:p>
     <w:p>
@@ -3019,7 +3019,7 @@
           <w:color w:val="333333"/>
           <w:sz w:val="18"/>
         </w:rPr>
-        <w:t>POST /api/rasid/accept</w:t>
+        <w:t>POST /api/external/v1/accept</w:t>
       </w:r>
     </w:p>
     <w:p>
@@ -3145,7 +3145,7 @@
           <w:color w:val="333333"/>
           <w:sz w:val="18"/>
         </w:rPr>
-        <w:t>POST /api/rasid/accept-batch</w:t>
+        <w:t>POST /api/external/v1/accept-batch</w:t>
       </w:r>
     </w:p>
     <w:p>
@@ -3271,7 +3271,7 @@
           <w:color w:val="333333"/>
           <w:sz w:val="18"/>
         </w:rPr>
-        <w:t>POST /api/rasid/accept-dispatch</w:t>
+        <w:t>POST /api/external/v1/accept-dispatch</w:t>
       </w:r>
     </w:p>
     <w:p>
@@ -3369,7 +3369,7 @@
           <w:color w:val="333333"/>
           <w:sz w:val="18"/>
         </w:rPr>
-        <w:t>POST /api/rasid/return</w:t>
+        <w:t>POST /api/external/v1/return</w:t>
       </w:r>
     </w:p>
     <w:p>
@@ -3495,7 +3495,7 @@
           <w:color w:val="333333"/>
           <w:sz w:val="18"/>
         </w:rPr>
-        <w:t>POST /api/rasid/return-batch</w:t>
+        <w:t>POST /api/external/v1/return-batch</w:t>
       </w:r>
     </w:p>
     <w:p>
@@ -3635,7 +3635,7 @@
           <w:color w:val="333333"/>
           <w:sz w:val="18"/>
         </w:rPr>
-        <w:t>POST /api/rasid/consume</w:t>
+        <w:t>POST /api/rasid/consume  ⚠️ Portal Session Only</w:t>
       </w:r>
     </w:p>
     <w:p>
@@ -3747,7 +3747,7 @@
           <w:color w:val="333333"/>
           <w:sz w:val="18"/>
         </w:rPr>
-        <w:t>POST /api/rasid/consume-cancel</w:t>
+        <w:t>POST /api/rasid/consume-cancel  ⚠️ Portal Session Only</w:t>
       </w:r>
     </w:p>
     <w:p>
@@ -3873,7 +3873,7 @@
           <w:color w:val="333333"/>
           <w:sz w:val="18"/>
         </w:rPr>
-        <w:t>POST /api/rasid/transfer</w:t>
+        <w:t>POST /api/external/v1/transfer</w:t>
       </w:r>
     </w:p>
     <w:p>
@@ -3999,7 +3999,7 @@
           <w:color w:val="333333"/>
           <w:sz w:val="18"/>
         </w:rPr>
-        <w:t>POST /api/rasid/transfer-cancel</w:t>
+        <w:t>POST /api/external/v1/transfer-cancel</w:t>
       </w:r>
     </w:p>
     <w:p>
@@ -4125,7 +4125,7 @@
           <w:color w:val="333333"/>
           <w:sz w:val="18"/>
         </w:rPr>
-        <w:t>POST /api/rasid/transfer-batch</w:t>
+        <w:t>POST /api/external/v1/transfer-batch</w:t>
       </w:r>
     </w:p>
     <w:p>
@@ -4251,7 +4251,7 @@
           <w:color w:val="333333"/>
           <w:sz w:val="18"/>
         </w:rPr>
-        <w:t>POST /api/rasid/transfer-cancel-batch</w:t>
+        <w:t>POST /api/external/v1/transfer-cancel-batch</w:t>
       </w:r>
     </w:p>
     <w:p>
@@ -4391,7 +4391,7 @@
           <w:color w:val="333333"/>
           <w:sz w:val="18"/>
         </w:rPr>
-        <w:t>POST /api/rasid/pharmacy-sale</w:t>
+        <w:t>POST /api/rasid/pharmacy-sale  ⚠️ Portal Session Only</w:t>
       </w:r>
     </w:p>
     <w:p>
@@ -4573,7 +4573,7 @@
           <w:color w:val="333333"/>
           <w:sz w:val="18"/>
         </w:rPr>
-        <w:t>POST /api/rasid/pharmacy-sale-cancel</w:t>
+        <w:t>POST /api/rasid/pharmacy-sale-cancel  ⚠️ Portal Session Only</w:t>
       </w:r>
     </w:p>
     <w:p>
@@ -4727,7 +4727,7 @@
           <w:color w:val="333333"/>
           <w:sz w:val="18"/>
         </w:rPr>
-        <w:t>POST /api/rasid/deactivation</w:t>
+        <w:t>POST /api/rasid/deactivation  ⚠️ Portal Session Only</w:t>
       </w:r>
     </w:p>
     <w:p>
@@ -4867,7 +4867,7 @@
           <w:color w:val="333333"/>
           <w:sz w:val="18"/>
         </w:rPr>
-        <w:t>POST /api/rasid/deactivation-cancel</w:t>
+        <w:t>POST /api/rasid/deactivation-cancel  ⚠️ Portal Session Only</w:t>
       </w:r>
     </w:p>
     <w:p>
@@ -4993,7 +4993,7 @@
           <w:color w:val="333333"/>
           <w:sz w:val="18"/>
         </w:rPr>
-        <w:t>POST /api/rasid/export</w:t>
+        <w:t>POST /api/rasid/export  ⚠️ Portal Session Only</w:t>
       </w:r>
     </w:p>
     <w:p>
@@ -5119,7 +5119,7 @@
           <w:color w:val="333333"/>
           <w:sz w:val="18"/>
         </w:rPr>
-        <w:t>POST /api/rasid/export-cancel</w:t>
+        <w:t>POST /api/rasid/export-cancel  ⚠️ Portal Session Only</w:t>
       </w:r>
     </w:p>
     <w:p>
@@ -5245,7 +5245,7 @@
           <w:color w:val="333333"/>
           <w:sz w:val="18"/>
         </w:rPr>
-        <w:t>POST /api/rasid/package-upload</w:t>
+        <w:t>POST /api/rasid/package-upload  ⚠️ Portal Session Only</w:t>
       </w:r>
     </w:p>
     <w:p>
@@ -5343,7 +5343,7 @@
           <w:color w:val="333333"/>
           <w:sz w:val="18"/>
         </w:rPr>
-        <w:t>POST /api/rasid/package-download</w:t>
+        <w:t>POST /api/rasid/package-download  ⚠️ Portal Session Only</w:t>
       </w:r>
     </w:p>
     <w:p>
@@ -5427,7 +5427,7 @@
           <w:color w:val="333333"/>
           <w:sz w:val="18"/>
         </w:rPr>
-        <w:t>POST /api/rasid/package-query</w:t>
+        <w:t>POST /api/rasid/package-query  ⚠️ Portal Session Only</w:t>
       </w:r>
     </w:p>
     <w:p>
@@ -5605,7 +5605,7 @@
           <w:color w:val="333333"/>
           <w:sz w:val="18"/>
         </w:rPr>
-        <w:t>POST /api/rasid/check-status</w:t>
+        <w:t>POST /api/rasid/check-status  ⚠️ Portal Session Only</w:t>
       </w:r>
     </w:p>
     <w:p>
@@ -5717,7 +5717,7 @@
           <w:color w:val="333333"/>
           <w:sz w:val="18"/>
         </w:rPr>
-        <w:t>POST /api/rasid/dispatch-detail</w:t>
+        <w:t>POST /api/rasid/dispatch-detail  ⚠️ Portal Session Only</w:t>
       </w:r>
     </w:p>
     <w:p>
@@ -5801,7 +5801,7 @@
           <w:color w:val="333333"/>
           <w:sz w:val="18"/>
         </w:rPr>
-        <w:t>POST /api/rasid/country-list</w:t>
+        <w:t>POST /api/rasid/country-list  ⚠️ Portal Session Only</w:t>
       </w:r>
     </w:p>
     <w:p/>
@@ -5830,7 +5830,7 @@
           <w:color w:val="333333"/>
           <w:sz w:val="18"/>
         </w:rPr>
-        <w:t>POST /api/rasid/city-list</w:t>
+        <w:t>POST /api/rasid/city-list  ⚠️ Portal Session Only</w:t>
       </w:r>
     </w:p>
     <w:p/>
@@ -5859,7 +5859,7 @@
           <w:color w:val="333333"/>
           <w:sz w:val="18"/>
         </w:rPr>
-        <w:t>POST /api/rasid/drug-list</w:t>
+        <w:t>POST /api/rasid/drug-list  ⚠️ Portal Session Only</w:t>
       </w:r>
     </w:p>
     <w:p>
@@ -5943,7 +5943,7 @@
           <w:color w:val="333333"/>
           <w:sz w:val="18"/>
         </w:rPr>
-        <w:t>POST /api/rasid/error-code-list</w:t>
+        <w:t>POST /api/rasid/error-code-list  ⚠️ Portal Session Only</w:t>
       </w:r>
     </w:p>
     <w:p/>
@@ -5972,7 +5972,7 @@
           <w:color w:val="333333"/>
           <w:sz w:val="18"/>
         </w:rPr>
-        <w:t>POST /api/rasid/stakeholder-list</w:t>
+        <w:t>POST /api/rasid/stakeholder-list  ⚠️ Portal Session Only</w:t>
       </w:r>
     </w:p>
     <w:p>
@@ -8155,7 +8155,7 @@
           <w:color w:val="333333"/>
           <w:sz w:val="18"/>
         </w:rPr>
-        <w:t>response = requests.post(f"{BASE_URL}/auth/test-connection", headers=headers)</w:t>
+        <w:t>response = requests.post(f"{BASE_URL}/auth/test-connection"  # Portal Session Only - requires cookie login, headers=headers)</w:t>
       </w:r>
     </w:p>
     <w:p>
@@ -8377,7 +8377,7 @@
           <w:color w:val="333333"/>
           <w:sz w:val="18"/>
         </w:rPr>
-        <w:t>response = requests.post(f"{BASE_URL}/rasid/dispatch", headers=headers, json=payload)</w:t>
+        <w:t>response = requests.post(f"{BASE_URL}/external/v1/dispatch", headers=headers, json=payload)</w:t>
       </w:r>
     </w:p>
     <w:p>
@@ -8682,7 +8682,7 @@
           <w:color w:val="333333"/>
           <w:sz w:val="18"/>
         </w:rPr>
-        <w:t>response = requests.post(f"{BASE_URL}/rasid/dispatch-batch", headers=headers, json=batch_payload)</w:t>
+        <w:t>response = requests.post(f"{BASE_URL}/external/v1/dispatch-batch", headers=headers, json=batch_payload)</w:t>
       </w:r>
     </w:p>
     <w:p>
@@ -8834,7 +8834,7 @@
           <w:color w:val="333333"/>
           <w:sz w:val="18"/>
         </w:rPr>
-        <w:t>response = requests.post(f"{BASE_URL}/rasid/check-status", headers=headers, json=status_payload)</w:t>
+        <w:t>response = requests.post(f"{BASE_URL}/rasid/check-status"  # Portal Session Only, headers=headers, json=status_payload)</w:t>
       </w:r>
     </w:p>
     <w:p>
@@ -8889,7 +8889,7 @@
           <w:color w:val="333333"/>
           <w:sz w:val="18"/>
         </w:rPr>
-        <w:t>response = requests.get(f"{BASE_URL}/rasid/history", headers=headers)</w:t>
+        <w:t>response = requests.get(f"{BASE_URL}/rasid/history"  # Portal Session Only, headers=headers)</w:t>
       </w:r>
     </w:p>
     <w:p>
@@ -9266,7 +9266,7 @@
           <w:color w:val="333333"/>
           <w:sz w:val="18"/>
         </w:rPr>
-        <w:t xml:space="preserve">            f"{self.base_url}/rasid/dispatch-batch",</w:t>
+        <w:t xml:space="preserve">            f"{self.base_url}/external/v1/dispatch-batch",</w:t>
       </w:r>
     </w:p>
     <w:p>
@@ -9434,7 +9434,7 @@
           <w:color w:val="333333"/>
           <w:sz w:val="18"/>
         </w:rPr>
-        <w:t xml:space="preserve">            f"{self.base_url}/rasid/accept-batch",</w:t>
+        <w:t xml:space="preserve">            f"{self.base_url}/external/v1/accept-batch",</w:t>
       </w:r>
     </w:p>
     <w:p>
@@ -9783,7 +9783,7 @@
           <w:color w:val="333333"/>
           <w:sz w:val="18"/>
         </w:rPr>
-        <w:t xml:space="preserve">  https://app.rsdway.com/api/rasid/dispatch-batch \</w:t>
+        <w:t xml:space="preserve">  https://app.rsdway.com/api/external/v1/dispatch-batch \</w:t>
       </w:r>
     </w:p>
     <w:p>
@@ -9950,7 +9950,7 @@
           <w:color w:val="333333"/>
           <w:sz w:val="18"/>
         </w:rPr>
-        <w:t xml:space="preserve">  https://app.rsdway.com/api/rasid/check-status \</w:t>
+        <w:t xml:space="preserve">  https://app.rsdway.com/api/rasid/check-status  # Portal Session Only \</w:t>
       </w:r>
     </w:p>
     <w:p>
@@ -10103,7 +10103,7 @@
           <w:color w:val="333333"/>
           <w:sz w:val="18"/>
         </w:rPr>
-        <w:t xml:space="preserve">  https://app.rsdway.com/api/rasid/history \</w:t>
+        <w:t xml:space="preserve">  https://app.rsdway.com/api/rasid/history  # Portal Session Only \</w:t>
       </w:r>
     </w:p>
     <w:p>
@@ -10370,7 +10370,7 @@
           <w:color w:val="333333"/>
           <w:sz w:val="18"/>
         </w:rPr>
-        <w:t xml:space="preserve">        $ch = curl_init("$this-&gt;baseUrl/rasid/dispatch-batch");</w:t>
+        <w:t xml:space="preserve">        $ch = curl_init("$this-&gt;baseUrl/external/v1/dispatch-batch");</w:t>
       </w:r>
     </w:p>
     <w:p>
@@ -16401,6 +16401,7 @@
           <w:rFonts w:ascii="Arial" w:hAnsi="Arial"/>
           <w:sz w:val="22"/>
         </w:rPr>
+        <w:t xml:space="preserve"> *(Portal Session Only — requires cookie login)*</w:t>
       </w:r>
     </w:p>
     <w:p>
@@ -16409,7 +16410,7 @@
           <w:rFonts w:ascii="Arial" w:hAnsi="Arial"/>
           <w:sz w:val="22"/>
         </w:rPr>
-        <w:t xml:space="preserve">- Test your connection: </w:t>
+        <w:t xml:space="preserve">- Test your connection via API key: use </w:t>
       </w:r>
       <w:r>
         <w:rPr>
@@ -16417,13 +16418,38 @@
           <w:color w:val="E83E3E"/>
           <w:sz w:val="18"/>
         </w:rPr>
-        <w:t>POST /api/auth/test-connection</w:t>
+        <w:t>POST /api/external/v1/dispatch</w:t>
       </w:r>
       <w:r>
         <w:rPr>
           <w:rFonts w:ascii="Arial" w:hAnsi="Arial"/>
           <w:sz w:val="22"/>
         </w:rPr>
+        <w:t xml:space="preserve"> with a test product</w:t>
+      </w:r>
+    </w:p>
+    <w:p>
+      <w:r>
+        <w:rPr>
+          <w:rFonts w:ascii="Arial" w:hAnsi="Arial"/>
+          <w:sz w:val="22"/>
+        </w:rPr>
+        <w:t xml:space="preserve">- Portal-only: </w:t>
+      </w:r>
+      <w:r>
+        <w:rPr>
+          <w:rFonts w:ascii="Courier New" w:hAnsi="Courier New"/>
+          <w:color w:val="E83E3E"/>
+          <w:sz w:val="18"/>
+        </w:rPr>
+        <w:t>POST /api/auth/test-connection</w:t>
+      </w:r>
+      <w:r>
+        <w:rPr>
+          <w:rFonts w:ascii="Arial" w:hAnsi="Arial"/>
+          <w:sz w:val="22"/>
+        </w:rPr>
+        <w:t xml:space="preserve"> *(requires cookie login, not API key)*</w:t>
       </w:r>
     </w:p>
     <w:p>

</xml_diff>